<commit_message>
Act on instructor feedback: flag-fidelity metric and grading sheet, Class 5 cost-per-successful-check analysis, report rewrite
</commit_message>
<xml_diff>
--- a/docs/PE6201_Problem_Statement_LIU_ZEYUAN_revised.docx
+++ b/docs/PE6201_Problem_Statement_LIU_ZEYUAN_revised.docx
@@ -632,13 +632,26 @@
                 <w:b/>
                 <w:sz w:val="19"/>
               </w:rPr>
-              <w:t>Cost:</w:t>
-            </w:r>
-            <w:r>
-              <w:rPr>
-                <w:sz w:val="19"/>
-              </w:rPr>
-              <w:t xml:space="preserve"> measured US$0.00014 and ~2 s per note; 20 clients weekly ≈ US$0.01 a month; 1,000 coaches ≈ US$11 a month. The rules path is free and works when the API is down. </w:t>
+              <w:t>Cost (Class 5 method):</w:t>
+            </w:r>
+            <w:r>
+              <w:rPr>
+                <w:sz w:val="19"/>
+              </w:rPr>
+              <w:t xml:space="preserve"> tokens are US$0.00014 per note, but a note the coach must redo costs a manual check — US$4.89 of coach time — so cost per </w:t>
+            </w:r>
+            <w:r>
+              <w:rPr>
+                <w:i/>
+                <w:sz w:val="19"/>
+              </w:rPr>
+              <w:t>successful</w:t>
+            </w:r>
+            <w:r>
+              <w:rPr>
+                <w:sz w:val="19"/>
+              </w:rPr>
+              <w:t xml:space="preserve"> check is set by the error rate and by the 22% of real cases routed to the coach, not by the model price. The rules path is free and works when the API is down. </w:t>
             </w:r>
             <w:r>
               <w:rPr>
@@ -891,13 +904,13 @@
                 <w:b/>
                 <w:sz w:val="19"/>
               </w:rPr>
-              <w:t>Metric: share of coach notes with no factual or direction error</w:t>
-            </w:r>
-            <w:r>
-              <w:rPr>
-                <w:sz w:val="19"/>
-              </w:rPr>
-              <w:t>, hand-graded by me. Target ≥ 95%; baseline: a chatbot answering directly gets the label itself right 38% of the time. Checks I run (python -m eval.run_eval, ~US$0.05): rules vs reference labels; prompt v1 vs v2; the model judge measured against my 20 hand labels (75% agreement, FAIL precision 60%, recall 86%); how often the system refuses or routes to a human.</w:t>
+              <w:t>Metric: flag fidelity</w:t>
+            </w:r>
+            <w:r>
+              <w:rPr>
+                <w:sz w:val="19"/>
+              </w:rPr>
+              <w:t xml:space="preserve"> — for 20 cases covering every flag type, does the coach note state every flag the rules raised and invent none? Scored 0/1 by hand. Target ≥ 19/20. This measures what the model does; the rules themselves are checked separately against independently computed reference labels (787/787), which tests my arithmetic, not the model. Baseline: a chatbot answering directly gets even the label right only 38% of the time. I also report the model judge's precision and recall against my hand labels (75% agreement, FAIL precision 60%, recall 86%) and how often the system refuses or routes to a human. Run with python -m eval.run_eval, ~US$0.05.</w:t>
             </w:r>
           </w:p>
         </w:tc>

</xml_diff>

<commit_message>
Report and problem statement updated with v3 held-out result and protein scope change
</commit_message>
<xml_diff>
--- a/docs/PE6201_Problem_Statement_LIU_ZEYUAN_revised.docx
+++ b/docs/PE6201_Problem_Statement_LIU_ZEYUAN_revised.docx
@@ -298,7 +298,7 @@
               <w:rPr>
                 <w:sz w:val="19"/>
               </w:rPr>
-              <w:t xml:space="preserve">A personal trainer cannot quickly tell whether a fat-loss client's daily intake is a sensible deficit: the answer depends on a per-client energy calculation, not the calorie number alone. By hand it takes 5–10 minutes per client — about 2 to 3 hours a week for a coach with 20 clients — and coaches round differently, so similar clients get different advice. A general chatbot is not the answer: in my A1 test gpt-4o-mini labelled these cases correctly only 38% of the time even when given the formula (majority baseline 25%). Calorie apps such as MyFitnessPal and MacroFactor set targets for one self-tracking user; they do not give a coach a consistent check across clients, show how sensitive the verdict is to logging error, or send unsafe cases to a person. </w:t>
+              <w:t xml:space="preserve">A personal trainer cannot quickly tell whether a fat-loss client's daily intake is a sensible deficit: the answer depends on a per-client energy calculation, not the calorie number alone. By hand it takes 5–10 minutes per client — about 2 to 3 hours a week for a coach with 20 clients — and coaches round differently, so similar clients get different advice. A general chatbot is not the answer: in my tests gpt-4o-mini labelled these cases correctly only 37–40% of the time even when given the formula (majority baseline 25%). Calorie apps such as MyFitnessPal and MacroFactor set targets for one self-tracking user; they do not give a coach a consistent check across clients, show how sensitive the verdict is to logging error, or send unsafe cases to a person. </w:t>
             </w:r>
             <w:r>
               <w:rPr>
@@ -311,7 +311,7 @@
               <w:rPr>
                 <w:sz w:val="19"/>
               </w:rPr>
-              <w:t xml:space="preserve"> meal plans, carbohydrate and fat targets, free-text food logs, under-18s, and any medical condition.</w:t>
+              <w:t xml:space="preserve"> meal plans, protein and other macronutrient targets, free-text food logs, under-18s, and any medical condition.</w:t>
             </w:r>
           </w:p>
         </w:tc>
@@ -503,7 +503,7 @@
               <w:rPr>
                 <w:sz w:val="19"/>
               </w:rPr>
-              <w:t>: BMR (Mifflin-St Jeor) × activity factor = TDEE; target deficit = 0.5–1% of body weight per week; label = no_deficit / too_small / appropriate / too_large. The non-AI baseline wins outright — rules 100% against reference labels, a foundation model classifying directly 38%. A foundation model is used only where it adds value: turning the rule output into a plain-English note for the coach. It is kept out of the arithmetic and out of safety decisions. No RAG (no documents to ground on) and no agent (no multi-step task).</w:t>
+              <w:t>: BMR (Mifflin-St Jeor) × activity factor = TDEE; target deficit = 0.5–1% of body weight per week; label = no_deficit / too_small / appropriate / too_large. The non-AI baseline wins outright — rules 100% against reference labels, a foundation model classifying directly 37–40%. A foundation model is used only where it adds value: turning the rule output into a plain-English note for the coach. It is kept out of the arithmetic and out of safety decisions. No RAG (no documents to ground on) and no agent (no multi-step task).</w:t>
             </w:r>
           </w:p>
         </w:tc>
@@ -615,7 +615,7 @@
               <w:rPr>
                 <w:sz w:val="19"/>
               </w:rPr>
-              <w:t>• Model — Rent · openai/gpt-4o-mini via OpenRouter, explanation only; my guard rejects any number not from the rules and falls back to a fixed template</w:t>
+              <w:t>• Model — Rent · openai/gpt-4o-mini via OpenRouter, explanation only. My guards check every note: a number not from the rules sends it back to a fixed template; a flag it left out is appended by code</w:t>
             </w:r>
           </w:p>
           <w:p>
@@ -767,7 +767,7 @@
                 <w:i/>
                 <w:sz w:val="19"/>
               </w:rPr>
-              <w:t>Limitation: I did not record the survey cycle or intake variable in A1.</w:t>
+              <w:t>Limitations: I did not record the survey cycle or intake variable in A1, and the extract lost the protein column — so protein could not be validated on real data and is out of scope.</w:t>
             </w:r>
           </w:p>
           <w:p>
@@ -782,13 +782,34 @@
                 <w:b/>
                 <w:sz w:val="19"/>
               </w:rPr>
-              <w:t>17 handwritten cases</w:t>
-            </w:r>
-            <w:r>
-              <w:rPr>
-                <w:sz w:val="19"/>
-              </w:rPr>
-              <w:t xml:space="preserve"> (safety, borderline, invalid, protein), expected outcomes fixed in a CSV before any run.</w:t>
+              <w:t>14 handwritten cases</w:t>
+            </w:r>
+            <w:r>
+              <w:rPr>
+                <w:sz w:val="19"/>
+              </w:rPr>
+              <w:t xml:space="preserve"> (safety, borderline, invalid, typical), expected outcomes fixed in a CSV before any run.</w:t>
+            </w:r>
+          </w:p>
+          <w:p>
+            <w:r>
+              <w:rPr>
+                <w:sz w:val="19"/>
+              </w:rPr>
+              <w:t xml:space="preserve">• </w:t>
+            </w:r>
+            <w:r>
+              <w:rPr>
+                <w:b/>
+                <w:sz w:val="19"/>
+              </w:rPr>
+              <w:t>20 held-out NHANES cases</w:t>
+            </w:r>
+            <w:r>
+              <w:rPr>
+                <w:sz w:val="19"/>
+              </w:rPr>
+              <w:t>, never used in any earlier run or in tuning, for the final hand-graded test.</w:t>
             </w:r>
           </w:p>
           <w:p>
@@ -910,7 +931,20 @@
               <w:rPr>
                 <w:sz w:val="19"/>
               </w:rPr>
-              <w:t xml:space="preserve"> — for 20 cases covering every flag type, does the coach note state every flag the rules raised and invent none? Scored 0/1 by hand. Target ≥ 19/20. This measures what the model does; the rules themselves are checked separately against independently computed reference labels (787/787), which tests my arithmetic, not the model. Baseline: a chatbot answering directly gets even the label right only 38% of the time. I also report the model judge's precision and recall against my hand labels (75% agreement, FAIL precision 60%, recall 86%) and how often the system refuses or routes to a human. Run with python -m eval.run_eval, ~US$0.05.</w:t>
+              <w:t xml:space="preserve"> — for 20 cases covering every flag type, does the coach note state every flag the rules raised and invent none? Scored 0/1 by hand. Target ≥ 19/20. </w:t>
+            </w:r>
+            <w:r>
+              <w:rPr>
+                <w:b/>
+                <w:sz w:val="19"/>
+              </w:rPr>
+              <w:t>Result: v2 scored 10/20 (every failure an omission, none invented); v3, which appends any omitted flag by code, scored 20/20 on the held-out cases</w:t>
+            </w:r>
+            <w:r>
+              <w:rPr>
+                <w:sz w:val="19"/>
+              </w:rPr>
+              <w:t xml:space="preserve"> (95% lower bound 86%). This measures what the model does; the rules themselves are checked separately against independently computed reference labels (787/787), which tests my arithmetic, not the model. Baseline: a chatbot answering directly gets even the label right only 37–40% of the time. I also report the model judge's precision and recall against my hand labels (75% agreement, FAIL precision 60%, recall 86%) and how often the system refuses or routes to a human. All evaluation cost US$0.30.</w:t>
             </w:r>
           </w:p>
         </w:tc>
@@ -996,20 +1030,7 @@
               <w:rPr>
                 <w:sz w:val="19"/>
               </w:rPr>
-              <w:t xml:space="preserve"> a fluent note that misstates a relation (v1: "150 g is </w:t>
-            </w:r>
-            <w:r>
-              <w:rPr>
-                <w:i/>
-                <w:sz w:val="19"/>
-              </w:rPr>
-              <w:t>above</w:t>
-            </w:r>
-            <w:r>
-              <w:rPr>
-                <w:sz w:val="19"/>
-              </w:rPr>
-              <w:t xml:space="preserve"> 128–176 g") — Comparisons pre-computed by code; number guard; judge + hand audit</w:t>
+              <w:t xml:space="preserve"> a fluent note that misstates a relation or quietly leaves out a flag (v2 omitted one in 10 of 20 notes) — Comparisons pre-computed by code; number guard; flag-coverage guard; hand audit on held-out cases</w:t>
             </w:r>
           </w:p>
           <w:p>

</xml_diff>

<commit_message>
Report, problem statement and README on the confirmatory result (primary = second grading)
</commit_message>
<xml_diff>
--- a/docs/PE6201_Problem_Statement_LIU_ZEYUAN_revised.docx
+++ b/docs/PE6201_Problem_Statement_LIU_ZEYUAN_revised.docx
@@ -803,13 +803,13 @@
                 <w:b/>
                 <w:sz w:val="19"/>
               </w:rPr>
-              <w:t>20 held-out NHANES cases</w:t>
-            </w:r>
-            <w:r>
-              <w:rPr>
-                <w:sz w:val="19"/>
-              </w:rPr>
-              <w:t>, never used in any earlier run or in tuning, for the final hand-graded test.</w:t>
+              <w:t>25 fresh NHANES cases</w:t>
+            </w:r>
+            <w:r>
+              <w:rPr>
+                <w:sz w:val="19"/>
+              </w:rPr>
+              <w:t xml:space="preserve"> for a pre-registered confirmatory test, never used in any earlier run or in tuning.</w:t>
             </w:r>
           </w:p>
           <w:p>
@@ -938,13 +938,13 @@
                 <w:b/>
                 <w:sz w:val="19"/>
               </w:rPr>
-              <w:t>Result: v2 scored 10/20 (every failure an omission, none invented); v3, which appends any omitted flag by code, scored 20/20 on the held-out cases</w:t>
-            </w:r>
-            <w:r>
-              <w:rPr>
-                <w:sz w:val="19"/>
-              </w:rPr>
-              <w:t xml:space="preserve"> (95% lower bound 86%). This measures what the model does; the rules themselves are checked separately against independently computed reference labels (787/787), which tests my arithmetic, not the model. Baseline: a chatbot answering directly gets even the label right only 37–40% of the time. I also report the model judge's precision and recall against my hand labels (75% agreement, FAIL precision 60%, recall 86%) and how often the system refuses or routes to a human. All evaluation cost US$0.30.</w:t>
+              <w:t>Result, from a pre-registered, paired, blind test on 25 new cases: the model's own notes passed 10/25; with v3's code appending any omitted flag, 25/25 (95% CI 86–100%). The detector caught all 16 omissions and the guard added no errors.</w:t>
+            </w:r>
+            <w:r>
+              <w:rPr>
+                <w:sz w:val="19"/>
+              </w:rPr>
+              <w:t xml:space="preserve"> This measures what the model does; the rules themselves are checked separately against independently computed reference labels (787/787), which tests my arithmetic, not the model. Baseline: a chatbot answering directly gets even the label right only 37–40% of the time. I also report the model judge's precision and recall against my hand labels (75% agreement, FAIL precision 60%, recall 86%) and how often the system refuses or routes to a human. All evaluation cost US$0.31.</w:t>
             </w:r>
           </w:p>
         </w:tc>
@@ -1030,7 +1030,7 @@
               <w:rPr>
                 <w:sz w:val="19"/>
               </w:rPr>
-              <w:t xml:space="preserve"> a fluent note that misstates a relation or quietly leaves out a flag (v2 omitted one in 10 of 20 notes) — Comparisons pre-computed by code; number guard; flag-coverage guard; hand audit on held-out cases</w:t>
+              <w:t xml:space="preserve"> a fluent note that misstates a relation or quietly leaves out a flag (unguarded, 15 of 25 notes did) — Comparisons pre-computed by code; number guard; flag-coverage guard; pre-registered hand audit</w:t>
             </w:r>
           </w:p>
           <w:p>

</xml_diff>